<commit_message>
Batch A web düzeltmeleri: firma/kullanıcı adı GUID yerine görünen ad, kota aktif sayısı, şablon yetki görüntüleme
- #13 Üst bar + Ana ekran + localStorage: CompanyId GUID yerine firma adı + kullanıcı adı (AuthState.CompanyName/UserName)
- #12 Kullanıcı düzenlemede mevcut şube adı (branchDisplay) açıkça gösteriliyor
- #14 Kota İzleme'ye "AKTİF" kullanıcı sayısı sütunu (QuotaMonitorRow.ActiveCount)
- #11 Yetki Şablonları'nda kaydedilmiş şablonun yetkileri "görüntüle" ile matriste gösteriliyor

Co-Authored-By: Claude Opus 4.8 <noreply@anthropic.com>
</commit_message>
<xml_diff>
--- a/proje notlar.docx
+++ b/proje notlar.docx
@@ -479,6 +479,385 @@
         </w:tabs>
         <w:ind w:left="360"/>
       </w:pPr>
+    </w:p>
+    <w:p>
+      <w:pPr>
+        <w:tabs>
+          <w:tab w:val="num" w:pos="720"/>
+        </w:tabs>
+        <w:ind w:left="360"/>
+      </w:pPr>
+      <w:proofErr w:type="spellStart"/>
+      <w:r>
+        <w:t>Webte</w:t>
+      </w:r>
+      <w:proofErr w:type="spellEnd"/>
+      <w:r>
+        <w:t xml:space="preserve"> hatalı alanlar:</w:t>
+      </w:r>
+    </w:p>
+    <w:p>
+      <w:pPr>
+        <w:pStyle w:val="ListeParagraf"/>
+        <w:numPr>
+          <w:ilvl w:val="0"/>
+          <w:numId w:val="3"/>
+        </w:numPr>
+        <w:tabs>
+          <w:tab w:val="num" w:pos="720"/>
+        </w:tabs>
+      </w:pPr>
+      <w:r>
+        <w:t>Malzeme Listesinde kayıt formu olmamalı sadece malzeme listesi ve detayı görünmeli. Detay kısmı masaüstü uygulama ile aynı olmalı.</w:t>
+      </w:r>
+    </w:p>
+    <w:p>
+      <w:pPr>
+        <w:pStyle w:val="ListeParagraf"/>
+      </w:pPr>
+    </w:p>
+    <w:p>
+      <w:pPr>
+        <w:pStyle w:val="ListeParagraf"/>
+        <w:numPr>
+          <w:ilvl w:val="0"/>
+          <w:numId w:val="3"/>
+        </w:numPr>
+        <w:tabs>
+          <w:tab w:val="num" w:pos="720"/>
+        </w:tabs>
+      </w:pPr>
+      <w:r>
+        <w:t>Yeni kayıt ekranında da sadece kayıt formu olmalı liste olmamalı.</w:t>
+      </w:r>
+    </w:p>
+    <w:p>
+      <w:pPr>
+        <w:pStyle w:val="ListeParagraf"/>
+      </w:pPr>
+    </w:p>
+    <w:p>
+      <w:pPr>
+        <w:pStyle w:val="ListeParagraf"/>
+        <w:numPr>
+          <w:ilvl w:val="0"/>
+          <w:numId w:val="3"/>
+        </w:numPr>
+        <w:tabs>
+          <w:tab w:val="num" w:pos="720"/>
+        </w:tabs>
+      </w:pPr>
+      <w:r>
+        <w:t>Stok Sayım ekranı Masaüstü uygulama ile aynı olmalı, ekran hala aktif değil. İçeriği boş.</w:t>
+      </w:r>
+    </w:p>
+    <w:p>
+      <w:pPr>
+        <w:pStyle w:val="ListeParagraf"/>
+      </w:pPr>
+    </w:p>
+    <w:p>
+      <w:pPr>
+        <w:pStyle w:val="ListeParagraf"/>
+        <w:numPr>
+          <w:ilvl w:val="0"/>
+          <w:numId w:val="3"/>
+        </w:numPr>
+        <w:tabs>
+          <w:tab w:val="num" w:pos="720"/>
+        </w:tabs>
+      </w:pPr>
+      <w:r>
+        <w:t>Yeni araç ekle ekranında ad alanı yok. Alanların masaüstü uygulama ile karşılaştır olmayan alanları masaüstü ile aynı ad olacak şekilde oluştur. Bu ekranda da araç listesi olmamalı sadece kayıt formu olmalı. Araç listesi ayrı ekran olmalı. Ayrı ekranı var ama Yeni araç ekle içinde oluşmuş.</w:t>
+      </w:r>
+    </w:p>
+    <w:p>
+      <w:pPr>
+        <w:pStyle w:val="ListeParagraf"/>
+      </w:pPr>
+    </w:p>
+    <w:p>
+      <w:pPr>
+        <w:pStyle w:val="ListeParagraf"/>
+        <w:numPr>
+          <w:ilvl w:val="0"/>
+          <w:numId w:val="3"/>
+        </w:numPr>
+        <w:tabs>
+          <w:tab w:val="num" w:pos="720"/>
+        </w:tabs>
+      </w:pPr>
+      <w:r>
+        <w:t>Muayene / Sigorta ekranında belge tipi sadece muayene olduğunda sonuç alanı oluşmalı. Diğerlerinde sonuç durumu bulunmamakta.</w:t>
+      </w:r>
+    </w:p>
+    <w:p>
+      <w:pPr>
+        <w:pStyle w:val="ListeParagraf"/>
+      </w:pPr>
+    </w:p>
+    <w:p>
+      <w:pPr>
+        <w:pStyle w:val="ListeParagraf"/>
+        <w:numPr>
+          <w:ilvl w:val="0"/>
+          <w:numId w:val="3"/>
+        </w:numPr>
+        <w:tabs>
+          <w:tab w:val="num" w:pos="720"/>
+        </w:tabs>
+      </w:pPr>
+      <w:r>
+        <w:t>Talep formu ekranı içerisinde de birden fazla sekme var. Ekran olarak menü altında ayrılmış ama içerik tek ekranda. Talep düzenle dediğimde talep bilgileri bütün verileriyle açılmalı, bu verilerin üzerinde güncelleme yapmalıyım. Yeni Kayıt formu gibi açılmamalı.</w:t>
+      </w:r>
+    </w:p>
+    <w:p>
+      <w:pPr>
+        <w:pStyle w:val="ListeParagraf"/>
+      </w:pPr>
+    </w:p>
+    <w:p>
+      <w:pPr>
+        <w:pStyle w:val="ListeParagraf"/>
+        <w:numPr>
+          <w:ilvl w:val="0"/>
+          <w:numId w:val="3"/>
+        </w:numPr>
+      </w:pPr>
+      <w:r>
+        <w:lastRenderedPageBreak/>
+        <w:t>Tanım düzenle ekranında sistemdeki “+” butonu olan, sabit tanım eklenebilen bütün alanlar olmalıdır ve ben bu alanlarda düzenleme yapabilmeliyim. Bu ekranın yapısı şu şekilde değişmeli: Bulunduğu ekran bilgisi, alan adı, alan tanımları olmalı. Eğer kullanıcı süper adminse alanın ID sini değiştirmeden alanı bozmadan alan adını değiştirebilsin. Diğer roller alan adı değişimi yapamasın.</w:t>
+      </w:r>
+    </w:p>
+    <w:p>
+      <w:pPr>
+        <w:pStyle w:val="ListeParagraf"/>
+      </w:pPr>
+    </w:p>
+    <w:p>
+      <w:pPr>
+        <w:pStyle w:val="ListeParagraf"/>
+        <w:numPr>
+          <w:ilvl w:val="0"/>
+          <w:numId w:val="3"/>
+        </w:numPr>
+      </w:pPr>
+      <w:r>
+        <w:t>Admin ve Süper admin kullanıcı silebilmeli. Süper admin kullanıcı verisini hiçbir rol görememeli. Admin, Süper admin kullanıcısını silememeli.</w:t>
+      </w:r>
+    </w:p>
+    <w:p>
+      <w:pPr>
+        <w:pStyle w:val="ListeParagraf"/>
+      </w:pPr>
+    </w:p>
+    <w:p>
+      <w:pPr>
+        <w:pStyle w:val="ListeParagraf"/>
+        <w:numPr>
+          <w:ilvl w:val="0"/>
+          <w:numId w:val="3"/>
+        </w:numPr>
+      </w:pPr>
+      <w:r>
+        <w:t>Geliştirici modu ekranı hala yapılmamış, ekranı oluştur.</w:t>
+      </w:r>
+    </w:p>
+    <w:p>
+      <w:pPr>
+        <w:pStyle w:val="ListeParagraf"/>
+      </w:pPr>
+    </w:p>
+    <w:p>
+      <w:pPr>
+        <w:pStyle w:val="ListeParagraf"/>
+        <w:numPr>
+          <w:ilvl w:val="0"/>
+          <w:numId w:val="3"/>
+        </w:numPr>
+      </w:pPr>
+      <w:r>
+        <w:t>Makine yönetimi ekranında pasife aldığım makineyi tekrar aktifleştiremiyorum, bunu düzelt.</w:t>
+      </w:r>
+    </w:p>
+    <w:p>
+      <w:pPr>
+        <w:pStyle w:val="ListeParagraf"/>
+      </w:pPr>
+    </w:p>
+    <w:p>
+      <w:pPr>
+        <w:pStyle w:val="ListeParagraf"/>
+        <w:numPr>
+          <w:ilvl w:val="0"/>
+          <w:numId w:val="3"/>
+        </w:numPr>
+      </w:pPr>
+      <w:r>
+        <w:t>Sunucu yedekleri ekranı hala yapılmamış,</w:t>
+      </w:r>
+      <w:r>
+        <w:t xml:space="preserve"> </w:t>
+      </w:r>
+      <w:r>
+        <w:t>ekranı oluştur.</w:t>
+      </w:r>
+    </w:p>
+    <w:p>
+      <w:pPr>
+        <w:pStyle w:val="ListeParagraf"/>
+        <w:tabs>
+          <w:tab w:val="num" w:pos="720"/>
+        </w:tabs>
+        <w:ind w:left="360"/>
+      </w:pPr>
+    </w:p>
+    <w:p>
+      <w:pPr>
+        <w:tabs>
+          <w:tab w:val="num" w:pos="720"/>
+        </w:tabs>
+        <w:ind w:left="360"/>
+      </w:pPr>
+      <w:r>
+        <w:t>+++++++++++++++++++++++++++++++++++++++++</w:t>
+      </w:r>
+    </w:p>
+    <w:p>
+      <w:pPr>
+        <w:pStyle w:val="ListeParagraf"/>
+      </w:pPr>
+      <w:r>
+        <w:t>Hem web hem Masaüstü uygulama hataları</w:t>
+      </w:r>
+    </w:p>
+    <w:p>
+      <w:pPr>
+        <w:pStyle w:val="ListeParagraf"/>
+      </w:pPr>
+    </w:p>
+    <w:p>
+      <w:pPr>
+        <w:pStyle w:val="ListeParagraf"/>
+      </w:pPr>
+      <w:r>
+        <w:t xml:space="preserve">Araç detayında </w:t>
+      </w:r>
+      <w:r>
+        <w:t>Uyumlu Malzemeler Muayene/Sigorta Bakım Takibi Araç Hareketleri</w:t>
+      </w:r>
+      <w:r>
+        <w:t xml:space="preserve"> sekmeleri mevcut değil. Aracın detaylarını incelediğim pencerede bu sekmelerinde olması gerek. Bu sekmenin verilerini ilgili ekranlardan araca dair güncel verileri almalı.</w:t>
+      </w:r>
+    </w:p>
+    <w:p>
+      <w:pPr>
+        <w:pStyle w:val="ListeParagraf"/>
+      </w:pPr>
+    </w:p>
+    <w:p>
+      <w:pPr>
+        <w:pStyle w:val="ListeParagraf"/>
+      </w:pPr>
+      <w:proofErr w:type="spellStart"/>
+      <w:r>
+        <w:t>Webte</w:t>
+      </w:r>
+      <w:proofErr w:type="spellEnd"/>
+      <w:r>
+        <w:t xml:space="preserve"> araçlar genel tanım ekranı hala aktif değil. Bu ekran web ile %100 aynı olmalı. Doğru bir şekilde ekranı web e göre oluştur.</w:t>
+      </w:r>
+    </w:p>
+    <w:p>
+      <w:pPr>
+        <w:pStyle w:val="ListeParagraf"/>
+      </w:pPr>
+    </w:p>
+    <w:p>
+      <w:pPr>
+        <w:pStyle w:val="ListeParagraf"/>
+        <w:tabs>
+          <w:tab w:val="num" w:pos="720"/>
+        </w:tabs>
+        <w:ind w:left="360"/>
+      </w:pPr>
+      <w:r>
+        <w:t>Muayene / Sigorta ekranında belge tipi sadece muayene olduğunda sonuç alanı oluşmalı. Diğerlerinde sonuç durumu bulunmamakta.</w:t>
+      </w:r>
+      <w:r>
+        <w:t xml:space="preserve"> Bu alan masaüstü uygulamada da düzeltilmeli.</w:t>
+      </w:r>
+    </w:p>
+    <w:p>
+      <w:pPr>
+        <w:pStyle w:val="ListeParagraf"/>
+        <w:tabs>
+          <w:tab w:val="num" w:pos="720"/>
+        </w:tabs>
+        <w:ind w:left="360"/>
+      </w:pPr>
+    </w:p>
+    <w:p>
+      <w:pPr>
+        <w:pStyle w:val="ListeParagraf"/>
+        <w:tabs>
+          <w:tab w:val="num" w:pos="720"/>
+        </w:tabs>
+        <w:ind w:left="360"/>
+      </w:pPr>
+      <w:r>
+        <w:t>Personel sil var ama düzenle yok iki projede de düzenle olmalı.</w:t>
+      </w:r>
+    </w:p>
+    <w:p>
+      <w:pPr>
+        <w:pStyle w:val="ListeParagraf"/>
+        <w:tabs>
+          <w:tab w:val="num" w:pos="720"/>
+        </w:tabs>
+        <w:ind w:left="360"/>
+      </w:pPr>
+    </w:p>
+    <w:p>
+      <w:pPr>
+        <w:pStyle w:val="ListeParagraf"/>
+        <w:tabs>
+          <w:tab w:val="num" w:pos="720"/>
+        </w:tabs>
+        <w:ind w:left="360"/>
+      </w:pPr>
+      <w:r>
+        <w:t>Araç bakımları ekranında Bakımı iptal et botunu olmamalı. Bakım sil ve düzelt botunu olabilir bakımın detayında.</w:t>
+      </w:r>
+    </w:p>
+    <w:p>
+      <w:pPr>
+        <w:pStyle w:val="ListeParagraf"/>
+        <w:tabs>
+          <w:tab w:val="num" w:pos="720"/>
+        </w:tabs>
+        <w:ind w:left="360"/>
+      </w:pPr>
+    </w:p>
+    <w:p>
+      <w:pPr>
+        <w:pStyle w:val="ListeParagraf"/>
+        <w:tabs>
+          <w:tab w:val="num" w:pos="720"/>
+        </w:tabs>
+        <w:ind w:left="360"/>
+      </w:pPr>
+      <w:r>
+        <w:t>Sanal bir ortamda makineyi aktife ve pasife alarak test gerçekleştir. Pasife aldığında login ekranından geçememeli. İnternet yok ise son durum pasife alındığı için yine login olamamalı. İnternete bağlanır ve süper admin aktife alırsa eğer makine login olabilmeli.</w:t>
+      </w:r>
+    </w:p>
+    <w:p>
+      <w:pPr>
+        <w:pStyle w:val="ListeParagraf"/>
+      </w:pPr>
+      <w:r>
+        <w:t>++++++++++++++++++++++++++++++++++++++++++++++</w:t>
+      </w:r>
     </w:p>
     <w:p>
       <w:pPr>
@@ -1485,7 +1864,6 @@
   <w:style w:type="character" w:default="1" w:styleId="VarsaylanParagrafYazTipi">
     <w:name w:val="Default Paragraph Font"/>
     <w:uiPriority w:val="1"/>
-    <w:semiHidden/>
     <w:unhideWhenUsed/>
   </w:style>
   <w:style w:type="table" w:default="1" w:styleId="NormalTablo">

</xml_diff>